<commit_message>
Cambios:  - Actualización del manual
</commit_message>
<xml_diff>
--- a/Documentación/Sebastian HR.docx
+++ b/Documentación/Sebastian HR.docx
@@ -17,9 +17,14 @@
         </w:rPr>
       </w:sdtEndPr>
       <w:sdtContent>
-        <w:p/>
         <w:p>
           <w:pPr>
+            <w:jc w:val="both"/>
+          </w:pPr>
+        </w:p>
+        <w:p>
+          <w:pPr>
+            <w:jc w:val="both"/>
             <w:rPr>
               <w:b/>
               <w:bCs/>
@@ -30,7 +35,7 @@
               <w:noProof/>
             </w:rPr>
             <w:drawing>
-              <wp:anchor distT="0" distB="0" distL="114300" distR="114300" simplePos="0" relativeHeight="251665408" behindDoc="0" locked="0" layoutInCell="1" allowOverlap="1" wp14:anchorId="759A4B8E" wp14:editId="653742F3">
+              <wp:anchor distT="0" distB="0" distL="114300" distR="114300" simplePos="0" relativeHeight="251665408" behindDoc="0" locked="0" layoutInCell="1" allowOverlap="1" wp14:anchorId="759A4B8E" wp14:editId="4B9F9589">
                 <wp:simplePos x="0" y="0"/>
                 <wp:positionH relativeFrom="column">
                   <wp:posOffset>130810</wp:posOffset>
@@ -540,6 +545,15 @@
     </w:sdt>
     <w:sdt>
       <w:sdtPr>
+        <w:rPr>
+          <w:rFonts w:asciiTheme="minorHAnsi" w:eastAsiaTheme="minorHAnsi" w:hAnsiTheme="minorHAnsi" w:cstheme="minorBidi"/>
+          <w:color w:val="auto"/>
+          <w:kern w:val="2"/>
+          <w:sz w:val="24"/>
+          <w:szCs w:val="24"/>
+          <w:lang w:eastAsia="en-US"/>
+          <w14:ligatures w14:val="standardContextual"/>
+        </w:rPr>
         <w:id w:val="412828399"/>
         <w:docPartObj>
           <w:docPartGallery w:val="Table of Contents"/>
@@ -548,21 +562,15 @@
       </w:sdtPr>
       <w:sdtEndPr>
         <w:rPr>
-          <w:rFonts w:asciiTheme="minorHAnsi" w:eastAsiaTheme="minorHAnsi" w:hAnsiTheme="minorHAnsi" w:cstheme="minorBidi"/>
           <w:b/>
           <w:bCs/>
-          <w:color w:val="auto"/>
-          <w:kern w:val="2"/>
-          <w:sz w:val="24"/>
-          <w:szCs w:val="24"/>
-          <w:lang w:eastAsia="en-US"/>
-          <w14:ligatures w14:val="standardContextual"/>
         </w:rPr>
       </w:sdtEndPr>
       <w:sdtContent>
         <w:p>
           <w:pPr>
             <w:pStyle w:val="TtuloTDC"/>
+            <w:jc w:val="both"/>
           </w:pPr>
           <w:r>
             <w:t xml:space="preserve">Índice: </w:t>
@@ -589,12 +597,11 @@
           <w:r>
             <w:fldChar w:fldCharType="separate"/>
           </w:r>
-          <w:hyperlink w:anchor="_Toc230861975" w:history="1">
+          <w:hyperlink w:anchor="_Toc230864910" w:history="1">
             <w:r>
               <w:rPr>
                 <w:rStyle w:val="Hipervnculo"/>
                 <w:noProof/>
-                <w:lang w:val="it-IT"/>
               </w:rPr>
               <w:t>1º Introducción</w:t>
             </w:r>
@@ -617,7 +624,7 @@
                 <w:noProof/>
                 <w:webHidden/>
               </w:rPr>
-              <w:instrText xml:space="preserve"> PAGEREF _Toc230861975 \h </w:instrText>
+              <w:instrText xml:space="preserve"> PAGEREF _Toc230864910 \h </w:instrText>
             </w:r>
             <w:r>
               <w:rPr>
@@ -660,14 +667,13 @@
               <w:lang w:eastAsia="es-ES"/>
             </w:rPr>
           </w:pPr>
-          <w:hyperlink w:anchor="_Toc230861976" w:history="1">
+          <w:hyperlink w:anchor="_Toc230864911" w:history="1">
             <w:r>
               <w:rPr>
                 <w:rStyle w:val="Hipervnculo"/>
                 <w:noProof/>
-                <w:lang w:val="it-IT"/>
-              </w:rPr>
-              <w:t>1º Pantalla principal:</w:t>
+              </w:rPr>
+              <w:t>2º Pantalla principal:</w:t>
             </w:r>
             <w:r>
               <w:rPr>
@@ -688,7 +694,7 @@
                 <w:noProof/>
                 <w:webHidden/>
               </w:rPr>
-              <w:instrText xml:space="preserve"> PAGEREF _Toc230861976 \h </w:instrText>
+              <w:instrText xml:space="preserve"> PAGEREF _Toc230864911 \h </w:instrText>
             </w:r>
             <w:r>
               <w:rPr>
@@ -731,13 +737,13 @@
               <w:lang w:eastAsia="es-ES"/>
             </w:rPr>
           </w:pPr>
-          <w:hyperlink w:anchor="_Toc230861977" w:history="1">
+          <w:hyperlink w:anchor="_Toc230864912" w:history="1">
             <w:r>
               <w:rPr>
                 <w:rStyle w:val="Hipervnculo"/>
                 <w:noProof/>
               </w:rPr>
-              <w:t>2º Pantalla notificaciones</w:t>
+              <w:t>3º Pantalla notificaciones</w:t>
             </w:r>
             <w:r>
               <w:rPr>
@@ -758,7 +764,7 @@
                 <w:noProof/>
                 <w:webHidden/>
               </w:rPr>
-              <w:instrText xml:space="preserve"> PAGEREF _Toc230861977 \h </w:instrText>
+              <w:instrText xml:space="preserve"> PAGEREF _Toc230864912 \h </w:instrText>
             </w:r>
             <w:r>
               <w:rPr>
@@ -801,14 +807,13 @@
               <w:lang w:eastAsia="es-ES"/>
             </w:rPr>
           </w:pPr>
-          <w:hyperlink w:anchor="_Toc230861978" w:history="1">
+          <w:hyperlink w:anchor="_Toc230864913" w:history="1">
             <w:r>
               <w:rPr>
                 <w:rStyle w:val="Hipervnculo"/>
                 <w:noProof/>
-                <w:lang w:val="pt-PT"/>
-              </w:rPr>
-              <w:t>3º Pantalla de empleados</w:t>
+              </w:rPr>
+              <w:t>4º Pantalla de empleados</w:t>
             </w:r>
             <w:r>
               <w:rPr>
@@ -829,7 +834,7 @@
                 <w:noProof/>
                 <w:webHidden/>
               </w:rPr>
-              <w:instrText xml:space="preserve"> PAGEREF _Toc230861978 \h </w:instrText>
+              <w:instrText xml:space="preserve"> PAGEREF _Toc230864913 \h </w:instrText>
             </w:r>
             <w:r>
               <w:rPr>
@@ -872,13 +877,13 @@
               <w:lang w:eastAsia="es-ES"/>
             </w:rPr>
           </w:pPr>
-          <w:hyperlink w:anchor="_Toc230861979" w:history="1">
+          <w:hyperlink w:anchor="_Toc230864914" w:history="1">
             <w:r>
               <w:rPr>
                 <w:rStyle w:val="Hipervnculo"/>
                 <w:noProof/>
               </w:rPr>
-              <w:t>4º Ficha del empleado</w:t>
+              <w:t>5º Ficha del empleado</w:t>
             </w:r>
             <w:r>
               <w:rPr>
@@ -899,7 +904,7 @@
                 <w:noProof/>
                 <w:webHidden/>
               </w:rPr>
-              <w:instrText xml:space="preserve"> PAGEREF _Toc230861979 \h </w:instrText>
+              <w:instrText xml:space="preserve"> PAGEREF _Toc230864914 \h </w:instrText>
             </w:r>
             <w:r>
               <w:rPr>
@@ -942,13 +947,13 @@
               <w:lang w:eastAsia="es-ES"/>
             </w:rPr>
           </w:pPr>
-          <w:hyperlink w:anchor="_Toc230861980" w:history="1">
+          <w:hyperlink w:anchor="_Toc230864915" w:history="1">
             <w:r>
               <w:rPr>
                 <w:rStyle w:val="Hipervnculo"/>
                 <w:noProof/>
               </w:rPr>
-              <w:t>5º Pantalla de equipos</w:t>
+              <w:t>6º Pantalla de equipos</w:t>
             </w:r>
             <w:r>
               <w:rPr>
@@ -969,7 +974,7 @@
                 <w:noProof/>
                 <w:webHidden/>
               </w:rPr>
-              <w:instrText xml:space="preserve"> PAGEREF _Toc230861980 \h </w:instrText>
+              <w:instrText xml:space="preserve"> PAGEREF _Toc230864915 \h </w:instrText>
             </w:r>
             <w:r>
               <w:rPr>
@@ -1012,13 +1017,13 @@
               <w:lang w:eastAsia="es-ES"/>
             </w:rPr>
           </w:pPr>
-          <w:hyperlink w:anchor="_Toc230861981" w:history="1">
+          <w:hyperlink w:anchor="_Toc230864916" w:history="1">
             <w:r>
               <w:rPr>
                 <w:rStyle w:val="Hipervnculo"/>
                 <w:noProof/>
               </w:rPr>
-              <w:t>6º Noticias</w:t>
+              <w:t>7º Noticias</w:t>
             </w:r>
             <w:r>
               <w:rPr>
@@ -1039,7 +1044,7 @@
                 <w:noProof/>
                 <w:webHidden/>
               </w:rPr>
-              <w:instrText xml:space="preserve"> PAGEREF _Toc230861981 \h </w:instrText>
+              <w:instrText xml:space="preserve"> PAGEREF _Toc230864916 \h </w:instrText>
             </w:r>
             <w:r>
               <w:rPr>
@@ -1082,13 +1087,13 @@
               <w:lang w:eastAsia="es-ES"/>
             </w:rPr>
           </w:pPr>
-          <w:hyperlink w:anchor="_Toc230861982" w:history="1">
+          <w:hyperlink w:anchor="_Toc230864917" w:history="1">
             <w:r>
               <w:rPr>
                 <w:rStyle w:val="Hipervnculo"/>
                 <w:noProof/>
               </w:rPr>
-              <w:t>7º Documentación</w:t>
+              <w:t>8º Documentación</w:t>
             </w:r>
             <w:r>
               <w:rPr>
@@ -1109,7 +1114,7 @@
                 <w:noProof/>
                 <w:webHidden/>
               </w:rPr>
-              <w:instrText xml:space="preserve"> PAGEREF _Toc230861982 \h </w:instrText>
+              <w:instrText xml:space="preserve"> PAGEREF _Toc230864917 \h </w:instrText>
             </w:r>
             <w:r>
               <w:rPr>
@@ -1152,13 +1157,13 @@
               <w:lang w:eastAsia="es-ES"/>
             </w:rPr>
           </w:pPr>
-          <w:hyperlink w:anchor="_Toc230861983" w:history="1">
+          <w:hyperlink w:anchor="_Toc230864918" w:history="1">
             <w:r>
               <w:rPr>
                 <w:rStyle w:val="Hipervnculo"/>
                 <w:noProof/>
               </w:rPr>
-              <w:t>8º Sugerencias</w:t>
+              <w:t>9º Sugerencias</w:t>
             </w:r>
             <w:r>
               <w:rPr>
@@ -1179,7 +1184,7 @@
                 <w:noProof/>
                 <w:webHidden/>
               </w:rPr>
-              <w:instrText xml:space="preserve"> PAGEREF _Toc230861983 \h </w:instrText>
+              <w:instrText xml:space="preserve"> PAGEREF _Toc230864918 \h </w:instrText>
             </w:r>
             <w:r>
               <w:rPr>
@@ -1222,13 +1227,13 @@
               <w:lang w:eastAsia="es-ES"/>
             </w:rPr>
           </w:pPr>
-          <w:hyperlink w:anchor="_Toc230861984" w:history="1">
+          <w:hyperlink w:anchor="_Toc230864919" w:history="1">
             <w:r>
               <w:rPr>
                 <w:rStyle w:val="Hipervnculo"/>
                 <w:noProof/>
               </w:rPr>
-              <w:t>9º Trucos / tips</w:t>
+              <w:t>10º Trucos / tips</w:t>
             </w:r>
             <w:r>
               <w:rPr>
@@ -1249,7 +1254,7 @@
                 <w:noProof/>
                 <w:webHidden/>
               </w:rPr>
-              <w:instrText xml:space="preserve"> PAGEREF _Toc230861984 \h </w:instrText>
+              <w:instrText xml:space="preserve"> PAGEREF _Toc230864919 \h </w:instrText>
             </w:r>
             <w:r>
               <w:rPr>
@@ -1269,7 +1274,7 @@
                 <w:noProof/>
                 <w:webHidden/>
               </w:rPr>
-              <w:t>8</w:t>
+              <w:t>9</w:t>
             </w:r>
             <w:r>
               <w:rPr>
@@ -1281,6 +1286,9 @@
           </w:hyperlink>
         </w:p>
         <w:p>
+          <w:pPr>
+            <w:jc w:val="both"/>
+          </w:pPr>
           <w:r>
             <w:rPr>
               <w:b/>
@@ -1294,83 +1302,82 @@
     <w:p>
       <w:pPr>
         <w:pStyle w:val="Ttulo1"/>
-        <w:rPr>
-          <w:lang w:val="it-IT"/>
-        </w:rPr>
-      </w:pPr>
-      <w:r>
-        <w:rPr>
-          <w:lang w:val="it-IT"/>
-        </w:rPr>
+        <w:jc w:val="both"/>
+      </w:pPr>
+      <w:r>
         <w:br w:type="page"/>
       </w:r>
-      <w:bookmarkStart w:id="0" w:name="_Toc230861975"/>
-      <w:r>
-        <w:rPr>
-          <w:lang w:val="it-IT"/>
-        </w:rPr>
+      <w:bookmarkStart w:id="0" w:name="_Toc230864910"/>
+      <w:r>
         <w:lastRenderedPageBreak/>
-        <w:t xml:space="preserve">1º </w:t>
+        <w:t>1º Introducción</w:t>
+      </w:r>
+      <w:bookmarkEnd w:id="0"/>
+    </w:p>
+    <w:p>
+      <w:pPr>
+        <w:jc w:val="both"/>
+      </w:pPr>
+      <w:r>
+        <w:t xml:space="preserve">Mediante este documento se </w:t>
       </w:r>
       <w:proofErr w:type="spellStart"/>
       <w:r>
-        <w:rPr>
-          <w:lang w:val="it-IT"/>
-        </w:rPr>
-        <w:t>I</w:t>
-      </w:r>
-      <w:r>
-        <w:rPr>
-          <w:lang w:val="it-IT"/>
-        </w:rPr>
-        <w:t>ntroducción</w:t>
-      </w:r>
-      <w:bookmarkEnd w:id="0"/>
+        <w:t>predente</w:t>
+      </w:r>
       <w:proofErr w:type="spellEnd"/>
-    </w:p>
-    <w:p>
-      <w:pPr>
-        <w:jc w:val="both"/>
-      </w:pPr>
-      <w:r>
-        <w:t xml:space="preserve">Mediante este documento se </w:t>
+      <w:r>
+        <w:t xml:space="preserve"> explicar de forma rápida y sencilla </w:t>
+      </w:r>
+      <w:r>
+        <w:t xml:space="preserve">el uso de </w:t>
       </w:r>
       <w:proofErr w:type="spellStart"/>
       <w:r>
-        <w:t>predente</w:t>
+        <w:t>Sebastian</w:t>
       </w:r>
       <w:proofErr w:type="spellEnd"/>
       <w:r>
-        <w:t xml:space="preserve"> explicar de forma rápida y sencilla </w:t>
-      </w:r>
-      <w:r>
-        <w:t xml:space="preserve">el uso de </w:t>
-      </w:r>
+        <w:t xml:space="preserve"> HR.</w:t>
+      </w:r>
+    </w:p>
+    <w:p>
+      <w:pPr>
+        <w:jc w:val="both"/>
+      </w:pPr>
+    </w:p>
+    <w:p>
+      <w:pPr>
+        <w:jc w:val="both"/>
+      </w:pPr>
       <w:proofErr w:type="spellStart"/>
       <w:r>
         <w:t>Sebastian</w:t>
       </w:r>
       <w:proofErr w:type="spellEnd"/>
       <w:r>
-        <w:t xml:space="preserve"> HR.</w:t>
-      </w:r>
-    </w:p>
-    <w:p>
-      <w:pPr>
-        <w:jc w:val="both"/>
-      </w:pPr>
-    </w:p>
-    <w:p>
-      <w:pPr>
-        <w:jc w:val="both"/>
-      </w:pPr>
+        <w:t xml:space="preserve"> HR es la evolución de </w:t>
+      </w:r>
       <w:proofErr w:type="spellStart"/>
       <w:r>
         <w:t>Sebastian</w:t>
       </w:r>
       <w:proofErr w:type="spellEnd"/>
       <w:r>
-        <w:t xml:space="preserve"> HR es la evolución de </w:t>
+        <w:t xml:space="preserve"> Portal del empleado. En esta nueva versión se añaden nuevas funcionalidades y rediseños de pantallas.</w:t>
+      </w:r>
+    </w:p>
+    <w:p>
+      <w:pPr>
+        <w:jc w:val="both"/>
+      </w:pPr>
+    </w:p>
+    <w:p>
+      <w:pPr>
+        <w:jc w:val="both"/>
+      </w:pPr>
+      <w:r>
+        <w:t>Las adaptaciones que se habían realizado para la versión anterior (</w:t>
       </w:r>
       <w:proofErr w:type="spellStart"/>
       <w:r>
@@ -1378,27 +1385,6 @@
       </w:r>
       <w:proofErr w:type="spellEnd"/>
       <w:r>
-        <w:t xml:space="preserve"> Portal del empleado. En esta nueva versión se añaden nuevas funcionalidades y rediseños de pantallas.</w:t>
-      </w:r>
-    </w:p>
-    <w:p>
-      <w:pPr>
-        <w:jc w:val="both"/>
-      </w:pPr>
-    </w:p>
-    <w:p>
-      <w:pPr>
-        <w:jc w:val="both"/>
-      </w:pPr>
-      <w:r>
-        <w:t>Las adaptaciones que se habían realizado para la versión anterior (</w:t>
-      </w:r>
-      <w:proofErr w:type="spellStart"/>
-      <w:r>
-        <w:t>Sebastian</w:t>
-      </w:r>
-      <w:proofErr w:type="spellEnd"/>
-      <w:r>
         <w:t xml:space="preserve"> Portal del empleado) se mantienen en está nueva </w:t>
       </w:r>
       <w:proofErr w:type="gramStart"/>
@@ -1409,23 +1395,17 @@
       <w:r>
         <w:t xml:space="preserve"> pero cambiando algún diseño en </w:t>
       </w:r>
-      <w:proofErr w:type="spellStart"/>
-      <w:proofErr w:type="gramStart"/>
-      <w:r>
-        <w:t>al</w:t>
-      </w:r>
-      <w:proofErr w:type="spellEnd"/>
-      <w:r>
-        <w:t xml:space="preserve"> visualización</w:t>
-      </w:r>
-      <w:proofErr w:type="gramEnd"/>
-      <w:r>
-        <w:t>.</w:t>
+      <w:r>
+        <w:t>la</w:t>
+      </w:r>
+      <w:r>
+        <w:t xml:space="preserve"> visualización.</w:t>
       </w:r>
     </w:p>
     <w:p>
       <w:pPr>
         <w:pStyle w:val="Ttulo1"/>
+        <w:jc w:val="both"/>
       </w:pPr>
       <w:r>
         <w:br w:type="page"/>
@@ -1433,6 +1413,7 @@
     </w:p>
     <w:p>
       <w:pPr>
+        <w:jc w:val="both"/>
         <w:rPr>
           <w:b/>
           <w:bCs/>
@@ -1442,42 +1423,26 @@
     <w:p>
       <w:pPr>
         <w:pStyle w:val="Ttulo1"/>
-        <w:rPr>
-          <w:lang w:val="it-IT"/>
-        </w:rPr>
+        <w:jc w:val="both"/>
       </w:pPr>
       <w:bookmarkStart w:id="1" w:name="_Toc230861144"/>
-      <w:bookmarkStart w:id="2" w:name="_Toc230861976"/>
-      <w:r>
-        <w:rPr>
-          <w:lang w:val="it-IT"/>
-        </w:rPr>
-        <w:t xml:space="preserve">1º Pantalla </w:t>
-      </w:r>
-      <w:proofErr w:type="spellStart"/>
-      <w:r>
-        <w:rPr>
-          <w:lang w:val="it-IT"/>
-        </w:rPr>
-        <w:t>principal</w:t>
-      </w:r>
-      <w:proofErr w:type="spellEnd"/>
-      <w:r>
-        <w:rPr>
-          <w:lang w:val="it-IT"/>
-        </w:rPr>
-        <w:t>:</w:t>
+      <w:bookmarkStart w:id="2" w:name="_Toc230864911"/>
+      <w:r>
+        <w:t>2</w:t>
+      </w:r>
+      <w:r>
+        <w:t>º Pantalla principal:</w:t>
       </w:r>
       <w:bookmarkEnd w:id="1"/>
       <w:bookmarkEnd w:id="2"/>
       <w:r>
-        <w:rPr>
-          <w:lang w:val="it-IT"/>
-        </w:rPr>
         <w:br/>
       </w:r>
     </w:p>
     <w:p>
+      <w:pPr>
+        <w:jc w:val="both"/>
+      </w:pPr>
       <w:r>
         <w:t>Este es el nuevo diseño de la pantalla principal. En el podemos observar 3 apartados:</w:t>
       </w:r>
@@ -1489,6 +1454,7 @@
           <w:ilvl w:val="0"/>
           <w:numId w:val="1"/>
         </w:numPr>
+        <w:jc w:val="both"/>
       </w:pPr>
       <w:r>
         <w:t>Nombre del empleado</w:t>
@@ -1501,6 +1467,7 @@
           <w:ilvl w:val="0"/>
           <w:numId w:val="1"/>
         </w:numPr>
+        <w:jc w:val="both"/>
       </w:pPr>
       <w:r>
         <w:rPr>
@@ -1520,6 +1487,7 @@
           <w:ilvl w:val="0"/>
           <w:numId w:val="1"/>
         </w:numPr>
+        <w:jc w:val="both"/>
       </w:pPr>
       <w:r>
         <w:rPr>
@@ -1539,11 +1507,13 @@
           <w:ilvl w:val="0"/>
           <w:numId w:val="1"/>
         </w:numPr>
+        <w:jc w:val="both"/>
       </w:pPr>
       <w:r>
         <w:rPr>
           <w:b/>
           <w:bCs/>
+          <w:noProof/>
         </w:rPr>
         <w:drawing>
           <wp:anchor distT="0" distB="0" distL="114300" distR="114300" simplePos="0" relativeHeight="251658240" behindDoc="0" locked="0" layoutInCell="1" allowOverlap="1" wp14:anchorId="1D16EFBF" wp14:editId="38AB95E9">
@@ -1617,8 +1587,15 @@
         <w:t xml:space="preserve"> Al igual que en la versión anterior disponemos del panel izquierdo con los accesos a los apartados.</w:t>
       </w:r>
     </w:p>
-    <w:p/>
-    <w:p>
+    <w:p>
+      <w:pPr>
+        <w:jc w:val="both"/>
+      </w:pPr>
+    </w:p>
+    <w:p>
+      <w:pPr>
+        <w:jc w:val="both"/>
+      </w:pPr>
       <w:r>
         <w:br w:type="page"/>
       </w:r>
@@ -1626,18 +1603,28 @@
     <w:p>
       <w:pPr>
         <w:pStyle w:val="Ttulo1"/>
+        <w:jc w:val="both"/>
       </w:pPr>
       <w:bookmarkStart w:id="3" w:name="_Toc230861145"/>
-      <w:bookmarkStart w:id="4" w:name="_Toc230861977"/>
+      <w:bookmarkStart w:id="4" w:name="_Toc230864912"/>
       <w:r>
         <w:lastRenderedPageBreak/>
-        <w:t>2º Pantalla notificaciones</w:t>
+        <w:t>3</w:t>
+      </w:r>
+      <w:r>
+        <w:t>º Pantalla notificaciones</w:t>
       </w:r>
       <w:bookmarkEnd w:id="3"/>
       <w:bookmarkEnd w:id="4"/>
     </w:p>
     <w:p>
-      <w:r>
+      <w:pPr>
+        <w:jc w:val="both"/>
+      </w:pPr>
+      <w:r>
+        <w:rPr>
+          <w:noProof/>
+        </w:rPr>
         <w:drawing>
           <wp:anchor distT="0" distB="0" distL="114300" distR="114300" simplePos="0" relativeHeight="251659264" behindDoc="0" locked="0" layoutInCell="1" allowOverlap="1" wp14:anchorId="78285CB5" wp14:editId="66ABCA2A">
             <wp:simplePos x="0" y="0"/>
@@ -1703,75 +1690,60 @@
         <w:t>Misma funcionalidad que en la versión anterior, pero con un nuevo diseño.</w:t>
       </w:r>
     </w:p>
-    <w:p/>
-    <w:p/>
+    <w:p>
+      <w:pPr>
+        <w:jc w:val="both"/>
+      </w:pPr>
+    </w:p>
+    <w:p>
+      <w:pPr>
+        <w:jc w:val="both"/>
+      </w:pPr>
+    </w:p>
     <w:p>
       <w:pPr>
         <w:pStyle w:val="Ttulo1"/>
-        <w:rPr>
-          <w:lang w:val="pt-PT"/>
-        </w:rPr>
+        <w:jc w:val="both"/>
       </w:pPr>
       <w:bookmarkStart w:id="5" w:name="_Toc230861146"/>
-      <w:bookmarkStart w:id="6" w:name="_Toc230861978"/>
-      <w:r>
-        <w:rPr>
-          <w:lang w:val="pt-PT"/>
-        </w:rPr>
-        <w:t xml:space="preserve">3º </w:t>
-      </w:r>
-      <w:proofErr w:type="spellStart"/>
-      <w:r>
-        <w:rPr>
-          <w:lang w:val="pt-PT"/>
-        </w:rPr>
-        <w:t>Pantalla</w:t>
-      </w:r>
-      <w:proofErr w:type="spellEnd"/>
-      <w:r>
-        <w:rPr>
-          <w:lang w:val="pt-PT"/>
-        </w:rPr>
-        <w:t xml:space="preserve"> de </w:t>
-      </w:r>
-      <w:proofErr w:type="spellStart"/>
-      <w:r>
-        <w:rPr>
-          <w:lang w:val="pt-PT"/>
-        </w:rPr>
-        <w:t>em</w:t>
-      </w:r>
-      <w:r>
-        <w:rPr>
-          <w:lang w:val="pt-PT"/>
-        </w:rPr>
-        <w:t>pleados</w:t>
+      <w:bookmarkStart w:id="6" w:name="_Toc230864913"/>
+      <w:r>
+        <w:t>4</w:t>
+      </w:r>
+      <w:r>
+        <w:t>º Pantalla de empleados</w:t>
       </w:r>
       <w:bookmarkEnd w:id="5"/>
       <w:bookmarkEnd w:id="6"/>
+    </w:p>
+    <w:p>
+      <w:pPr>
+        <w:ind w:left="708"/>
+        <w:jc w:val="both"/>
+      </w:pPr>
+      <w:r>
+        <w:t>Pantalla donde veremos todos l</w:t>
+      </w:r>
+      <w:r>
+        <w:t xml:space="preserve">os empleados que tenemos dados de alta en </w:t>
+      </w:r>
+      <w:proofErr w:type="spellStart"/>
+      <w:r>
+        <w:t>Sebastian</w:t>
+      </w:r>
       <w:proofErr w:type="spellEnd"/>
-    </w:p>
-    <w:p>
-      <w:pPr>
-        <w:ind w:left="708"/>
-      </w:pPr>
-      <w:r>
-        <w:t>Pantalla donde veremos todos l</w:t>
-      </w:r>
-      <w:r>
-        <w:t xml:space="preserve">os empleados que tenemos dados de alta en </w:t>
-      </w:r>
-      <w:proofErr w:type="spellStart"/>
-      <w:r>
-        <w:t>Sebastian</w:t>
-      </w:r>
-      <w:proofErr w:type="spellEnd"/>
       <w:r>
         <w:t xml:space="preserve"> HR.</w:t>
       </w:r>
     </w:p>
     <w:p>
-      <w:r>
+      <w:pPr>
+        <w:jc w:val="both"/>
+      </w:pPr>
+      <w:r>
+        <w:rPr>
+          <w:noProof/>
+        </w:rPr>
         <w:drawing>
           <wp:anchor distT="0" distB="0" distL="114300" distR="114300" simplePos="0" relativeHeight="251660288" behindDoc="0" locked="0" layoutInCell="1" allowOverlap="1" wp14:anchorId="43A7E21C" wp14:editId="5892B5C8">
             <wp:simplePos x="0" y="0"/>
@@ -1834,23 +1806,42 @@
         </w:drawing>
       </w:r>
     </w:p>
-    <w:p/>
-    <w:p/>
-    <w:p/>
+    <w:p>
+      <w:pPr>
+        <w:jc w:val="both"/>
+      </w:pPr>
+    </w:p>
+    <w:p>
+      <w:pPr>
+        <w:jc w:val="both"/>
+      </w:pPr>
+    </w:p>
+    <w:p>
+      <w:pPr>
+        <w:jc w:val="both"/>
+      </w:pPr>
+    </w:p>
     <w:p>
       <w:pPr>
         <w:pStyle w:val="Ttulo1"/>
+        <w:jc w:val="both"/>
       </w:pPr>
       <w:bookmarkStart w:id="7" w:name="_Toc230861147"/>
-      <w:bookmarkStart w:id="8" w:name="_Toc230861979"/>
+      <w:bookmarkStart w:id="8" w:name="_Toc230864914"/>
       <w:r>
         <w:lastRenderedPageBreak/>
-        <w:t>4º Ficha del empleado</w:t>
+        <w:t>5</w:t>
+      </w:r>
+      <w:r>
+        <w:t>º Ficha del empleado</w:t>
       </w:r>
       <w:bookmarkEnd w:id="7"/>
       <w:bookmarkEnd w:id="8"/>
     </w:p>
     <w:p>
+      <w:pPr>
+        <w:jc w:val="both"/>
+      </w:pPr>
       <w:r>
         <w:t>Cuando entremos dentro de la ficha de un empleado, veremos la siguiente información:</w:t>
       </w:r>
@@ -1863,6 +1854,7 @@
           <w:numId w:val="2"/>
         </w:numPr>
         <w:ind w:left="567" w:hanging="207"/>
+        <w:jc w:val="both"/>
       </w:pPr>
       <w:r>
         <w:t>Panel izquierdo con accesos directos</w:t>
@@ -1876,6 +1868,7 @@
           <w:numId w:val="2"/>
         </w:numPr>
         <w:ind w:left="567" w:hanging="207"/>
+        <w:jc w:val="both"/>
       </w:pPr>
       <w:r>
         <w:rPr>
@@ -1896,6 +1889,7 @@
           <w:numId w:val="2"/>
         </w:numPr>
         <w:ind w:left="567" w:hanging="207"/>
+        <w:jc w:val="both"/>
       </w:pPr>
       <w:r>
         <w:t>Módulo de información de los marcajes</w:t>
@@ -1909,9 +1903,16 @@
           <w:numId w:val="2"/>
         </w:numPr>
         <w:ind w:left="567" w:hanging="207"/>
+        <w:jc w:val="both"/>
       </w:pPr>
       <w:r>
         <w:t>Módulo de las notificaciones del empleado</w:t>
+      </w:r>
+      <w:r>
+        <w:t xml:space="preserve">. Desde este apartado podremos dar de alta notificaciones directamente al empleado. </w:t>
+      </w:r>
+      <w:r>
+        <w:t>Las notificaciones realizadas a cada empleado, también se podrán visualizar desde este apartado.</w:t>
       </w:r>
     </w:p>
     <w:p>
@@ -1922,6 +1923,7 @@
           <w:numId w:val="2"/>
         </w:numPr>
         <w:ind w:left="567" w:hanging="207"/>
+        <w:jc w:val="both"/>
       </w:pPr>
       <w:r>
         <w:t>Módulo de los documentos del empleado</w:t>
@@ -1935,21 +1937,22 @@
           <w:numId w:val="2"/>
         </w:numPr>
         <w:ind w:left="567" w:hanging="207"/>
+        <w:jc w:val="both"/>
+      </w:pPr>
+      <w:r>
+        <w:t>Chat para poder hablar con el empleado.</w:t>
+      </w:r>
+    </w:p>
+    <w:p>
+      <w:pPr>
+        <w:jc w:val="both"/>
       </w:pPr>
       <w:r>
         <w:drawing>
-          <wp:anchor distT="0" distB="0" distL="114300" distR="114300" simplePos="0" relativeHeight="251661312" behindDoc="0" locked="0" layoutInCell="1" allowOverlap="1" wp14:anchorId="1C84E722" wp14:editId="103C0A8A">
-            <wp:simplePos x="0" y="0"/>
-            <wp:positionH relativeFrom="margin">
-              <wp:align>right</wp:align>
-            </wp:positionH>
-            <wp:positionV relativeFrom="paragraph">
-              <wp:posOffset>379730</wp:posOffset>
-            </wp:positionV>
-            <wp:extent cx="5400040" cy="2539365"/>
-            <wp:effectExtent l="19050" t="19050" r="10160" b="13335"/>
-            <wp:wrapSquare wrapText="bothSides"/>
-            <wp:docPr id="1447105512" name="Imagen 1"/>
+          <wp:inline distT="0" distB="0" distL="0" distR="0" wp14:anchorId="3661B585" wp14:editId="0D542D15">
+            <wp:extent cx="5400040" cy="2571115"/>
+            <wp:effectExtent l="19050" t="19050" r="10160" b="19685"/>
+            <wp:docPr id="169566878" name="Imagen 1"/>
             <wp:cNvGraphicFramePr>
               <a:graphicFrameLocks xmlns:a="http://schemas.openxmlformats.org/drawingml/2006/main" noChangeAspect="1"/>
             </wp:cNvGraphicFramePr>
@@ -1957,17 +1960,11 @@
               <a:graphicData uri="http://schemas.openxmlformats.org/drawingml/2006/picture">
                 <pic:pic xmlns:pic="http://schemas.openxmlformats.org/drawingml/2006/picture">
                   <pic:nvPicPr>
-                    <pic:cNvPr id="1447105512" name=""/>
+                    <pic:cNvPr id="169566878" name=""/>
                     <pic:cNvPicPr/>
                   </pic:nvPicPr>
                   <pic:blipFill>
-                    <a:blip r:embed="rId13" cstate="print">
-                      <a:extLst>
-                        <a:ext uri="{28A0092B-C50C-407E-A947-70E740481C1C}">
-                          <a14:useLocalDpi xmlns:a14="http://schemas.microsoft.com/office/drawing/2010/main" val="0"/>
-                        </a:ext>
-                      </a:extLst>
-                    </a:blip>
+                    <a:blip r:embed="rId13"/>
                     <a:stretch>
                       <a:fillRect/>
                     </a:stretch>
@@ -1975,7 +1972,7 @@
                   <pic:spPr>
                     <a:xfrm>
                       <a:off x="0" y="0"/>
-                      <a:ext cx="5400040" cy="2539365"/>
+                      <a:ext cx="5400040" cy="2571115"/>
                     </a:xfrm>
                     <a:prstGeom prst="rect">
                       <a:avLst/>
@@ -1989,34 +1986,48 @@
                 </pic:pic>
               </a:graphicData>
             </a:graphic>
-            <wp14:sizeRelH relativeFrom="page">
-              <wp14:pctWidth>0</wp14:pctWidth>
-            </wp14:sizeRelH>
-            <wp14:sizeRelV relativeFrom="page">
-              <wp14:pctHeight>0</wp14:pctHeight>
-            </wp14:sizeRelV>
-          </wp:anchor>
+          </wp:inline>
         </w:drawing>
       </w:r>
-      <w:r>
-        <w:t>Chat para poder hablar con el empleado.</w:t>
-      </w:r>
-    </w:p>
-    <w:p/>
-    <w:p>
+    </w:p>
+    <w:p>
+      <w:pPr>
+        <w:jc w:val="both"/>
+      </w:pPr>
+    </w:p>
+    <w:p>
+      <w:pPr>
+        <w:jc w:val="both"/>
+      </w:pPr>
+      <w:r>
+        <w:t>El recuadro rojo se habilita con la fecha, donde podremos ver la información adicional del empleado.</w:t>
+      </w:r>
       <w:r>
         <w:br w:type="page"/>
       </w:r>
     </w:p>
     <w:p>
       <w:pPr>
+        <w:jc w:val="both"/>
+      </w:pPr>
+    </w:p>
+    <w:p>
+      <w:pPr>
+        <w:jc w:val="both"/>
+      </w:pPr>
+    </w:p>
+    <w:p>
+      <w:pPr>
         <w:pStyle w:val="Ttulo1"/>
+        <w:jc w:val="both"/>
       </w:pPr>
       <w:bookmarkStart w:id="9" w:name="_Toc230861148"/>
-      <w:bookmarkStart w:id="10" w:name="_Toc230861980"/>
-      <w:r>
-        <w:lastRenderedPageBreak/>
-        <w:t>5º Pantalla de equipos</w:t>
+      <w:bookmarkStart w:id="10" w:name="_Toc230864915"/>
+      <w:r>
+        <w:t>6</w:t>
+      </w:r>
+      <w:r>
+        <w:t>º Pantalla de equipos</w:t>
       </w:r>
       <w:bookmarkEnd w:id="9"/>
       <w:bookmarkEnd w:id="10"/>
@@ -2026,6 +2037,7 @@
         <w:tabs>
           <w:tab w:val="left" w:pos="5655"/>
         </w:tabs>
+        <w:jc w:val="both"/>
       </w:pPr>
       <w:r>
         <w:t>Pantalla donde podremos ver los distintos equipos que se han creado</w:t>
@@ -2036,8 +2048,12 @@
         <w:tabs>
           <w:tab w:val="left" w:pos="5655"/>
         </w:tabs>
-      </w:pPr>
-      <w:r>
+        <w:jc w:val="both"/>
+      </w:pPr>
+      <w:r>
+        <w:rPr>
+          <w:noProof/>
+        </w:rPr>
         <w:drawing>
           <wp:inline distT="0" distB="0" distL="0" distR="0" wp14:anchorId="76C4AC0A" wp14:editId="75862E71">
             <wp:extent cx="5400040" cy="2545715"/>
@@ -2085,16 +2101,21 @@
         <w:tabs>
           <w:tab w:val="left" w:pos="5655"/>
         </w:tabs>
+        <w:jc w:val="both"/>
       </w:pPr>
     </w:p>
     <w:p>
       <w:pPr>
         <w:pStyle w:val="Ttulo1"/>
+        <w:jc w:val="both"/>
       </w:pPr>
       <w:bookmarkStart w:id="11" w:name="_Toc230861149"/>
-      <w:bookmarkStart w:id="12" w:name="_Toc230861981"/>
-      <w:r>
-        <w:t>6º Noticias</w:t>
+      <w:bookmarkStart w:id="12" w:name="_Toc230864916"/>
+      <w:r>
+        <w:t>7</w:t>
+      </w:r>
+      <w:r>
+        <w:t>º Noticias</w:t>
       </w:r>
       <w:bookmarkEnd w:id="11"/>
       <w:bookmarkEnd w:id="12"/>
@@ -2104,6 +2125,7 @@
         <w:tabs>
           <w:tab w:val="left" w:pos="5655"/>
         </w:tabs>
+        <w:jc w:val="both"/>
       </w:pPr>
       <w:r>
         <w:t>Pantalla donde veremos las noticias que se vayan dando de alta</w:t>
@@ -2114,8 +2136,12 @@
         <w:tabs>
           <w:tab w:val="left" w:pos="5655"/>
         </w:tabs>
-      </w:pPr>
-      <w:r>
+        <w:jc w:val="both"/>
+      </w:pPr>
+      <w:r>
+        <w:rPr>
+          <w:noProof/>
+        </w:rPr>
         <w:drawing>
           <wp:inline distT="0" distB="0" distL="0" distR="0" wp14:anchorId="0441722C" wp14:editId="0CB557E7">
             <wp:extent cx="5400040" cy="2503805"/>
@@ -2158,31 +2184,68 @@
         </w:drawing>
       </w:r>
     </w:p>
-    <w:p/>
-    <w:p/>
-    <w:p/>
-    <w:p/>
-    <w:p/>
-    <w:p/>
+    <w:p>
+      <w:pPr>
+        <w:jc w:val="both"/>
+      </w:pPr>
+    </w:p>
+    <w:p>
+      <w:pPr>
+        <w:jc w:val="both"/>
+      </w:pPr>
+    </w:p>
+    <w:p>
+      <w:pPr>
+        <w:jc w:val="both"/>
+      </w:pPr>
+    </w:p>
+    <w:p>
+      <w:pPr>
+        <w:jc w:val="both"/>
+      </w:pPr>
+    </w:p>
+    <w:p>
+      <w:pPr>
+        <w:jc w:val="both"/>
+      </w:pPr>
+    </w:p>
+    <w:p>
+      <w:pPr>
+        <w:jc w:val="both"/>
+      </w:pPr>
+    </w:p>
     <w:p>
       <w:pPr>
         <w:pStyle w:val="Ttulo1"/>
+        <w:jc w:val="both"/>
       </w:pPr>
       <w:bookmarkStart w:id="13" w:name="_Toc230861150"/>
-      <w:bookmarkStart w:id="14" w:name="_Toc230861982"/>
-      <w:r>
-        <w:t>7º Documentación</w:t>
+      <w:bookmarkStart w:id="14" w:name="_Toc230864917"/>
+      <w:r>
+        <w:t>8</w:t>
+      </w:r>
+      <w:r>
+        <w:t>º Documentación</w:t>
       </w:r>
       <w:bookmarkEnd w:id="13"/>
       <w:bookmarkEnd w:id="14"/>
     </w:p>
     <w:p>
+      <w:pPr>
+        <w:jc w:val="both"/>
+      </w:pPr>
       <w:r>
         <w:t>Pantalla donde se informará de la documentación publica accesible para todos los empleados</w:t>
       </w:r>
     </w:p>
     <w:p>
-      <w:r>
+      <w:pPr>
+        <w:jc w:val="both"/>
+      </w:pPr>
+      <w:r>
+        <w:rPr>
+          <w:noProof/>
+        </w:rPr>
         <w:drawing>
           <wp:inline distT="0" distB="0" distL="0" distR="0" wp14:anchorId="496A8762" wp14:editId="4453A2DB">
             <wp:extent cx="5400040" cy="2536190"/>
@@ -2225,26 +2288,43 @@
         </w:drawing>
       </w:r>
     </w:p>
-    <w:p/>
+    <w:p>
+      <w:pPr>
+        <w:jc w:val="both"/>
+      </w:pPr>
+    </w:p>
     <w:p>
       <w:pPr>
         <w:pStyle w:val="Ttulo1"/>
+        <w:jc w:val="both"/>
       </w:pPr>
       <w:bookmarkStart w:id="15" w:name="_Toc230861151"/>
-      <w:bookmarkStart w:id="16" w:name="_Toc230861983"/>
-      <w:r>
-        <w:t>8º Sugerencias</w:t>
+      <w:bookmarkStart w:id="16" w:name="_Toc230864918"/>
+      <w:r>
+        <w:t>9</w:t>
+      </w:r>
+      <w:r>
+        <w:t>º Sugerencias</w:t>
       </w:r>
       <w:bookmarkEnd w:id="15"/>
       <w:bookmarkEnd w:id="16"/>
     </w:p>
     <w:p>
+      <w:pPr>
+        <w:jc w:val="both"/>
+      </w:pPr>
       <w:r>
         <w:t>Pantalla de visualización de las sugerencias</w:t>
       </w:r>
     </w:p>
     <w:p>
-      <w:r>
+      <w:pPr>
+        <w:jc w:val="both"/>
+      </w:pPr>
+      <w:r>
+        <w:rPr>
+          <w:noProof/>
+        </w:rPr>
         <w:drawing>
           <wp:inline distT="0" distB="0" distL="0" distR="0" wp14:anchorId="7769AEBC" wp14:editId="065BF495">
             <wp:extent cx="5400040" cy="2558415"/>
@@ -2287,20 +2367,32 @@
         </w:drawing>
       </w:r>
     </w:p>
-    <w:p/>
-    <w:p>
-      <w:r>
+    <w:p>
+      <w:pPr>
+        <w:jc w:val="both"/>
+      </w:pPr>
+    </w:p>
+    <w:p>
+      <w:pPr>
+        <w:jc w:val="both"/>
+      </w:pPr>
+      <w:r>
+        <w:lastRenderedPageBreak/>
         <w:br w:type="page"/>
       </w:r>
     </w:p>
     <w:p>
       <w:pPr>
         <w:pStyle w:val="Ttulo1"/>
-      </w:pPr>
-      <w:bookmarkStart w:id="17" w:name="_Toc230861984"/>
+        <w:jc w:val="both"/>
+      </w:pPr>
+      <w:bookmarkStart w:id="17" w:name="_Toc230864919"/>
       <w:r>
         <w:lastRenderedPageBreak/>
-        <w:t xml:space="preserve">9º Trucos / </w:t>
+        <w:t>10</w:t>
+      </w:r>
+      <w:r>
+        <w:t xml:space="preserve">º Trucos / </w:t>
       </w:r>
       <w:proofErr w:type="spellStart"/>
       <w:r>
@@ -2310,6 +2402,9 @@
       <w:proofErr w:type="spellEnd"/>
     </w:p>
     <w:p>
+      <w:pPr>
+        <w:jc w:val="both"/>
+      </w:pPr>
       <w:r>
         <w:t xml:space="preserve">En este apartado se van a explicar algunos de los </w:t>
       </w:r>
@@ -2329,6 +2424,7 @@
           <w:ilvl w:val="0"/>
           <w:numId w:val="3"/>
         </w:numPr>
+        <w:jc w:val="both"/>
         <w:rPr>
           <w:b/>
           <w:bCs/>
@@ -2345,6 +2441,7 @@
     <w:p>
       <w:pPr>
         <w:pStyle w:val="Prrafodelista"/>
+        <w:jc w:val="both"/>
         <w:rPr>
           <w:b/>
           <w:bCs/>
@@ -2363,6 +2460,7 @@
     <w:p>
       <w:pPr>
         <w:pStyle w:val="Prrafodelista"/>
+        <w:jc w:val="both"/>
         <w:rPr>
           <w:b/>
           <w:bCs/>
@@ -2372,6 +2470,7 @@
         <w:rPr>
           <w:b/>
           <w:bCs/>
+          <w:noProof/>
         </w:rPr>
         <w:drawing>
           <wp:anchor distT="0" distB="0" distL="114300" distR="114300" simplePos="0" relativeHeight="251666432" behindDoc="0" locked="0" layoutInCell="1" allowOverlap="1" wp14:anchorId="16F2ABCA" wp14:editId="7E97CA9D">
@@ -2433,6 +2532,7 @@
     <w:p>
       <w:pPr>
         <w:pStyle w:val="Prrafodelista"/>
+        <w:jc w:val="both"/>
         <w:rPr>
           <w:b/>
           <w:bCs/>
@@ -2442,6 +2542,7 @@
     <w:p>
       <w:pPr>
         <w:pStyle w:val="Prrafodelista"/>
+        <w:jc w:val="both"/>
         <w:rPr>
           <w:b/>
           <w:bCs/>
@@ -2451,6 +2552,7 @@
     <w:p>
       <w:pPr>
         <w:pStyle w:val="Prrafodelista"/>
+        <w:jc w:val="both"/>
         <w:rPr>
           <w:b/>
           <w:bCs/>
@@ -2460,6 +2562,7 @@
     <w:p>
       <w:pPr>
         <w:pStyle w:val="Prrafodelista"/>
+        <w:jc w:val="both"/>
         <w:rPr>
           <w:b/>
           <w:bCs/>
@@ -2469,6 +2572,7 @@
     <w:p>
       <w:pPr>
         <w:pStyle w:val="Prrafodelista"/>
+        <w:jc w:val="both"/>
         <w:rPr>
           <w:b/>
           <w:bCs/>
@@ -2478,6 +2582,7 @@
     <w:p>
       <w:pPr>
         <w:pStyle w:val="Prrafodelista"/>
+        <w:jc w:val="both"/>
         <w:rPr>
           <w:b/>
           <w:bCs/>
@@ -2487,6 +2592,7 @@
     <w:p>
       <w:pPr>
         <w:pStyle w:val="Prrafodelista"/>
+        <w:jc w:val="both"/>
         <w:rPr>
           <w:b/>
           <w:bCs/>
@@ -2496,6 +2602,7 @@
     <w:p>
       <w:pPr>
         <w:pStyle w:val="Prrafodelista"/>
+        <w:jc w:val="both"/>
         <w:rPr>
           <w:b/>
           <w:bCs/>
@@ -2505,6 +2612,7 @@
     <w:p>
       <w:pPr>
         <w:pStyle w:val="Prrafodelista"/>
+        <w:jc w:val="both"/>
         <w:rPr>
           <w:b/>
           <w:bCs/>
@@ -2514,6 +2622,7 @@
     <w:p>
       <w:pPr>
         <w:pStyle w:val="Prrafodelista"/>
+        <w:jc w:val="both"/>
         <w:rPr>
           <w:b/>
           <w:bCs/>
@@ -2523,6 +2632,7 @@
     <w:p>
       <w:pPr>
         <w:pStyle w:val="Prrafodelista"/>
+        <w:jc w:val="both"/>
         <w:rPr>
           <w:b/>
           <w:bCs/>
@@ -2532,6 +2642,7 @@
     <w:p>
       <w:pPr>
         <w:pStyle w:val="Prrafodelista"/>
+        <w:jc w:val="both"/>
         <w:rPr>
           <w:b/>
           <w:bCs/>
@@ -2546,6 +2657,7 @@
           <w:numId w:val="3"/>
         </w:numPr>
         <w:ind w:left="1418" w:hanging="338"/>
+        <w:jc w:val="both"/>
         <w:rPr>
           <w:b/>
           <w:bCs/>
@@ -2570,6 +2682,7 @@
           <w:numId w:val="3"/>
         </w:numPr>
         <w:ind w:left="1418" w:hanging="284"/>
+        <w:jc w:val="both"/>
         <w:rPr>
           <w:b/>
           <w:bCs/>
@@ -2597,6 +2710,7 @@
     <w:p>
       <w:pPr>
         <w:pStyle w:val="Prrafodelista"/>
+        <w:jc w:val="both"/>
         <w:rPr>
           <w:b/>
           <w:bCs/>

</xml_diff>